<commit_message>
fixed the broken url issue
</commit_message>
<xml_diff>
--- a/public/Resume.docx
+++ b/public/Resume.docx
@@ -15,6 +15,26 @@
           <w:rStyle w:val="IntenseReference"/>
         </w:rPr>
         <w:t>SHREYA GARG</w:t>
+      </w:r>
+    </w:p>
+    <w:p>
+      <w:pPr>
+        <w:jc w:val="center"/>
+        <w:rPr>
+          <w:rFonts w:ascii="Times New Roman" w:hAnsi="Times New Roman" w:cs="Times New Roman"/>
+        </w:rPr>
+      </w:pPr>
+      <w:r>
+        <w:rPr>
+          <w:rFonts w:ascii="Times New Roman" w:hAnsi="Times New Roman" w:cs="Times New Roman"/>
+        </w:rPr>
+        <w:t xml:space="preserve">99, block C, Beta 1, </w:t>
+      </w:r>
+      <w:r>
+        <w:rPr>
+          <w:rFonts w:ascii="Times New Roman" w:hAnsi="Times New Roman" w:cs="Times New Roman"/>
+        </w:rPr>
+        <w:t>Greater Noida, Uttar Pradesh – 201310</w:t>
       </w:r>
     </w:p>
     <w:p>
@@ -69,13 +89,17 @@
       <w:r>
         <w:t xml:space="preserve"> </w:t>
       </w:r>
-      <w:hyperlink r:id="rId6" w:history="1">
+      <w:hyperlink r:id="rId6" w:tgtFrame="_blank" w:history="1">
+        <w:proofErr w:type="spellStart"/>
         <w:r>
           <w:rPr>
             <w:rStyle w:val="Hyperlink"/>
+            <w:b/>
+            <w:bCs/>
           </w:rPr>
-          <w:t>github.com/shreya0517</w:t>
+          <w:t>shreyagargportfolio.netlify.app</w:t>
         </w:r>
+        <w:proofErr w:type="spellEnd"/>
       </w:hyperlink>
       <w:r>
         <w:rPr>
@@ -144,7 +168,31 @@
           <w:iCs w:val="0"/>
           <w:color w:val="auto"/>
         </w:rPr>
-        <w:t>Software Development Engineer Intern, Bluestock Fintech</w:t>
+        <w:t xml:space="preserve">Software Development Engineer Intern, </w:t>
+      </w:r>
+      <w:proofErr w:type="spellStart"/>
+      <w:r>
+        <w:rPr>
+          <w:rFonts w:eastAsiaTheme="minorHAnsi" w:cstheme="minorBidi"/>
+          <w:b/>
+          <w:bCs/>
+          <w:i w:val="0"/>
+          <w:iCs w:val="0"/>
+          <w:color w:val="auto"/>
+        </w:rPr>
+        <w:t>Bluestock</w:t>
+      </w:r>
+      <w:proofErr w:type="spellEnd"/>
+      <w:r>
+        <w:rPr>
+          <w:rFonts w:eastAsiaTheme="minorHAnsi" w:cstheme="minorBidi"/>
+          <w:b/>
+          <w:bCs/>
+          <w:i w:val="0"/>
+          <w:iCs w:val="0"/>
+          <w:color w:val="auto"/>
+        </w:rPr>
+        <w:t xml:space="preserve"> Fintech</w:t>
       </w:r>
       <w:r>
         <w:rPr>
@@ -318,12 +366,23 @@
       <w:pPr>
         <w:spacing w:line="240" w:lineRule="auto"/>
       </w:pPr>
-      <w:r>
-        <w:rPr>
-          <w:b/>
-          <w:bCs/>
-        </w:rPr>
-        <w:t>B.Tech – Computer Science and Engineering, GGSIPU, New Delhi</w:t>
+      <w:proofErr w:type="spellStart"/>
+      <w:proofErr w:type="gramStart"/>
+      <w:r>
+        <w:rPr>
+          <w:b/>
+          <w:bCs/>
+        </w:rPr>
+        <w:t>B.Tech</w:t>
+      </w:r>
+      <w:proofErr w:type="spellEnd"/>
+      <w:proofErr w:type="gramEnd"/>
+      <w:r>
+        <w:rPr>
+          <w:b/>
+          <w:bCs/>
+        </w:rPr>
+        <w:t xml:space="preserve"> – Computer Science and Engineering, GGSIPU, New Delhi</w:t>
       </w:r>
       <w:r>
         <w:tab/>
@@ -394,14 +453,14 @@
           <w:sz w:val="20"/>
           <w:szCs w:val="20"/>
         </w:rPr>
-        <w:t>CGPA: 9.6</w:t>
-      </w:r>
-      <w:r>
-        <w:rPr>
-          <w:sz w:val="20"/>
-          <w:szCs w:val="20"/>
-        </w:rPr>
-        <w:t xml:space="preserve"> | 9.2 | 8.9 | 9.0 | 8.8</w:t>
+        <w:t xml:space="preserve">CGPA: </w:t>
+      </w:r>
+      <w:r>
+        <w:rPr>
+          <w:sz w:val="20"/>
+          <w:szCs w:val="20"/>
+        </w:rPr>
+        <w:t>9.2</w:t>
       </w:r>
     </w:p>
     <w:p>
@@ -608,12 +667,6 @@
         <w:spacing w:line="240" w:lineRule="auto"/>
         <w:jc w:val="both"/>
         <w:rPr>
-          <w:sz w:val="20"/>
-          <w:szCs w:val="20"/>
-        </w:rPr>
-      </w:pPr>
-      <w:r>
-        <w:rPr>
           <w:rStyle w:val="IntenseEmphasis"/>
           <w:b/>
           <w:bCs/>
@@ -621,35 +674,54 @@
           <w:iCs w:val="0"/>
           <w:color w:val="auto"/>
         </w:rPr>
-        <w:t>Nazeon​ -</w:t>
-      </w:r>
-      <w:r>
-        <w:rPr>
-          <w:sz w:val="20"/>
-          <w:szCs w:val="20"/>
-        </w:rPr>
-        <w:t xml:space="preserve"> </w:t>
-      </w:r>
-      <w:r>
-        <w:rPr>
-          <w:sz w:val="20"/>
-          <w:szCs w:val="20"/>
-        </w:rPr>
-        <w:t>Built a futuristic, cyberpunk-themed command-line style web interface that simulates a hacking terminal with animated text effects, themed UI, and interactive commands, focused on an immersive user experience and clean front-end architecture</w:t>
-      </w:r>
-      <w:r>
-        <w:rPr>
-          <w:sz w:val="20"/>
-          <w:szCs w:val="20"/>
-        </w:rPr>
-        <w:t xml:space="preserve">.    </w:t>
-      </w:r>
+      </w:pPr>
+      <w:proofErr w:type="spellStart"/>
+      <w:proofErr w:type="gramStart"/>
+      <w:r>
+        <w:rPr>
+          <w:rStyle w:val="IntenseEmphasis"/>
+          <w:b/>
+          <w:bCs/>
+          <w:i w:val="0"/>
+          <w:iCs w:val="0"/>
+          <w:color w:val="auto"/>
+        </w:rPr>
+        <w:t>Nazeon</w:t>
+      </w:r>
+      <w:proofErr w:type="spellEnd"/>
+      <w:r>
+        <w:rPr>
+          <w:rStyle w:val="IntenseEmphasis"/>
+          <w:b/>
+          <w:bCs/>
+          <w:i w:val="0"/>
+          <w:iCs w:val="0"/>
+          <w:color w:val="auto"/>
+        </w:rPr>
+        <w:t xml:space="preserve">​ </w:t>
+      </w:r>
+      <w:r>
+        <w:rPr>
+          <w:rStyle w:val="IntenseEmphasis"/>
+          <w:b/>
+          <w:bCs/>
+          <w:i w:val="0"/>
+          <w:iCs w:val="0"/>
+          <w:color w:val="auto"/>
+        </w:rPr>
+        <w:t>:</w:t>
+      </w:r>
+      <w:proofErr w:type="gramEnd"/>
     </w:p>
     <w:p>
       <w:pPr>
         <w:spacing w:line="240" w:lineRule="auto"/>
         <w:jc w:val="both"/>
         <w:rPr>
+          <w:rStyle w:val="IntenseEmphasis"/>
+          <w:i w:val="0"/>
+          <w:iCs w:val="0"/>
+          <w:color w:val="auto"/>
           <w:sz w:val="20"/>
           <w:szCs w:val="20"/>
         </w:rPr>
@@ -668,7 +740,23 @@
           <w:sz w:val="20"/>
           <w:szCs w:val="20"/>
         </w:rPr>
-        <w:t xml:space="preserve"> HTML, CSS, JavaScript (DOM manipulation, event handling, animations), playsound, JSON-based configuration, command-line interface design</w:t>
+        <w:t xml:space="preserve"> HTML, CSS, JavaScript (DOM manipulation, event handling, animations), </w:t>
+      </w:r>
+      <w:proofErr w:type="spellStart"/>
+      <w:r>
+        <w:rPr>
+          <w:sz w:val="20"/>
+          <w:szCs w:val="20"/>
+        </w:rPr>
+        <w:t>playsound</w:t>
+      </w:r>
+      <w:proofErr w:type="spellEnd"/>
+      <w:r>
+        <w:rPr>
+          <w:sz w:val="20"/>
+          <w:szCs w:val="20"/>
+        </w:rPr>
+        <w:t>, JSON-based configuration, command-line interface design</w:t>
       </w:r>
       <w:r>
         <w:rPr>
@@ -676,6 +764,37 @@
           <w:szCs w:val="20"/>
         </w:rPr>
         <w:t xml:space="preserve">                                                                                     </w:t>
+      </w:r>
+    </w:p>
+    <w:p>
+      <w:pPr>
+        <w:spacing w:line="240" w:lineRule="auto"/>
+        <w:jc w:val="both"/>
+        <w:rPr>
+          <w:sz w:val="20"/>
+          <w:szCs w:val="20"/>
+        </w:rPr>
+      </w:pPr>
+      <w:r>
+        <w:rPr>
+          <w:sz w:val="20"/>
+          <w:szCs w:val="20"/>
+        </w:rPr>
+        <w:t xml:space="preserve"> </w:t>
+      </w:r>
+      <w:r>
+        <w:rPr>
+          <w:sz w:val="20"/>
+          <w:szCs w:val="20"/>
+        </w:rPr>
+        <w:t>Built a futuristic, cyberpunk-themed command-line style web interface that simulates a hacking terminal with animated text effects, themed UI, and interactive commands, focused on an immersive user experience and clean front-end architecture</w:t>
+      </w:r>
+      <w:r>
+        <w:rPr>
+          <w:sz w:val="20"/>
+          <w:szCs w:val="20"/>
+        </w:rPr>
+        <w:t xml:space="preserve">.    </w:t>
       </w:r>
     </w:p>
     <w:p>
@@ -731,6 +850,7 @@
           <w:szCs w:val="20"/>
         </w:rPr>
       </w:pPr>
+      <w:proofErr w:type="spellStart"/>
       <w:r>
         <w:rPr>
           <w:rStyle w:val="IntenseEmphasis"/>
@@ -740,7 +860,19 @@
           <w:iCs w:val="0"/>
           <w:color w:val="auto"/>
         </w:rPr>
-        <w:t>CodeSync -</w:t>
+        <w:t>CodeSync</w:t>
+      </w:r>
+      <w:proofErr w:type="spellEnd"/>
+      <w:r>
+        <w:rPr>
+          <w:rStyle w:val="IntenseEmphasis"/>
+          <w:b/>
+          <w:bCs/>
+          <w:i w:val="0"/>
+          <w:iCs w:val="0"/>
+          <w:color w:val="auto"/>
+        </w:rPr>
+        <w:t xml:space="preserve"> -</w:t>
       </w:r>
       <w:r>
         <w:rPr>
@@ -751,24 +883,12 @@
       </w:r>
       <w:r>
         <w:rPr>
-          <w:sz w:val="20"/>
-          <w:szCs w:val="20"/>
-        </w:rPr>
-        <w:t>Distributed Code Collaboration Platform: Built a full-stack web application for managing code repositories with features like user authentication, repository creation, access control, and collaborative code management, along with search and filtering for repositories and users.</w:t>
-      </w:r>
-      <w:r>
-        <w:rPr>
-          <w:sz w:val="20"/>
-          <w:szCs w:val="20"/>
-        </w:rPr>
-        <w:t xml:space="preserve"> </w:t>
-      </w:r>
-      <w:r>
-        <w:rPr>
-          <w:sz w:val="20"/>
-          <w:szCs w:val="20"/>
-        </w:rPr>
-        <w:t xml:space="preserve">           </w:t>
+          <w:b/>
+          <w:bCs/>
+          <w:sz w:val="20"/>
+          <w:szCs w:val="20"/>
+        </w:rPr>
+        <w:t>Distributed Code Collaboration Platform:</w:t>
       </w:r>
     </w:p>
     <w:p>
@@ -802,6 +922,37 @@
           <w:szCs w:val="20"/>
         </w:rPr>
         <w:t xml:space="preserve">                                                                                                    </w:t>
+      </w:r>
+    </w:p>
+    <w:p>
+      <w:pPr>
+        <w:spacing w:line="240" w:lineRule="auto"/>
+        <w:jc w:val="both"/>
+        <w:rPr>
+          <w:sz w:val="20"/>
+          <w:szCs w:val="20"/>
+        </w:rPr>
+      </w:pPr>
+      <w:r>
+        <w:rPr>
+          <w:sz w:val="20"/>
+          <w:szCs w:val="20"/>
+        </w:rPr>
+        <w:t xml:space="preserve"> Built a full-stack web application for managing code repositories with features like user authentication, repository creation, access control, and collaborative code management, along with search and filtering for repositories and users.</w:t>
+      </w:r>
+      <w:r>
+        <w:rPr>
+          <w:sz w:val="20"/>
+          <w:szCs w:val="20"/>
+        </w:rPr>
+        <w:t xml:space="preserve"> </w:t>
+      </w:r>
+      <w:r>
+        <w:rPr>
+          <w:sz w:val="20"/>
+          <w:szCs w:val="20"/>
+        </w:rPr>
+        <w:t xml:space="preserve">           </w:t>
       </w:r>
     </w:p>
     <w:p>
@@ -866,6 +1017,7 @@
         <w:t xml:space="preserve">- </w:t>
       </w:r>
       <w:hyperlink r:id="rId9" w:tgtFrame="_blank" w:history="1">
+        <w:proofErr w:type="spellStart"/>
         <w:r>
           <w:rPr>
             <w:rStyle w:val="Hyperlink"/>
@@ -876,6 +1028,7 @@
           </w:rPr>
           <w:t>versioncontrolapp.netlify.app</w:t>
         </w:r>
+        <w:proofErr w:type="spellEnd"/>
       </w:hyperlink>
       <w:r>
         <w:rPr>
@@ -1014,14 +1167,7 @@
           <w:sz w:val="20"/>
           <w:szCs w:val="20"/>
         </w:rPr>
-        <w:t xml:space="preserve">, </w:t>
-      </w:r>
-      <w:r>
-        <w:rPr>
-          <w:sz w:val="20"/>
-          <w:szCs w:val="20"/>
-        </w:rPr>
-        <w:t>PHP</w:t>
+        <w:t>, PHP</w:t>
       </w:r>
       <w:r>
         <w:rPr>
@@ -1097,93 +1243,13 @@
     </w:p>
     <w:p>
       <w:pPr>
-        <w:pStyle w:val="Heading3"/>
         <w:spacing w:after="0"/>
         <w:jc w:val="both"/>
         <w:rPr>
-          <w:b/>
-          <w:bCs/>
-          <w:sz w:val="24"/>
-          <w:szCs w:val="24"/>
-        </w:rPr>
-      </w:pPr>
-      <w:r>
-        <w:rPr>
-          <w:b/>
-          <w:bCs/>
-          <w:sz w:val="24"/>
-          <w:szCs w:val="24"/>
-        </w:rPr>
-        <w:t>SOFT SKILLS</w:t>
-      </w:r>
-    </w:p>
-    <w:p>
-      <w:pPr>
-        <w:spacing w:after="0"/>
-        <w:jc w:val="both"/>
-        <w:rPr>
-          <w:sz w:val="20"/>
-          <w:szCs w:val="20"/>
-        </w:rPr>
-      </w:pPr>
-      <w:r>
-        <w:rPr>
-          <w:sz w:val="20"/>
-          <w:szCs w:val="20"/>
-        </w:rPr>
-        <w:t>Handle high-pressure, team-based environments effectively; competitive volleyball experience reinforces collaboration and resilience.​</w:t>
-      </w:r>
-    </w:p>
-    <w:p>
-      <w:pPr>
-        <w:spacing w:after="0"/>
-        <w:jc w:val="both"/>
-        <w:rPr>
-          <w:sz w:val="20"/>
-          <w:szCs w:val="20"/>
-        </w:rPr>
-      </w:pPr>
-      <w:r>
-        <w:rPr>
-          <w:sz w:val="20"/>
-          <w:szCs w:val="20"/>
-        </w:rPr>
-        <w:t>Demonstrated leadership and ownership in projects and hackathons (including SIH), with strong decision-making.​</w:t>
-      </w:r>
-    </w:p>
-    <w:p>
-      <w:pPr>
-        <w:spacing w:after="0"/>
-        <w:jc w:val="both"/>
-        <w:rPr>
-          <w:sz w:val="20"/>
-          <w:szCs w:val="20"/>
-        </w:rPr>
-      </w:pPr>
-      <w:r>
-        <w:rPr>
-          <w:sz w:val="20"/>
-          <w:szCs w:val="20"/>
-        </w:rPr>
-        <w:t>Communicate technical concepts clearly to diverse stakeholders, enabling smooth cross-functional collaboration.​</w:t>
-      </w:r>
-    </w:p>
-    <w:p>
-      <w:pPr>
-        <w:spacing w:after="0"/>
-        <w:jc w:val="both"/>
-        <w:rPr>
-          <w:sz w:val="20"/>
-          <w:szCs w:val="20"/>
-        </w:rPr>
-      </w:pPr>
-      <w:r>
-        <w:rPr>
-          <w:sz w:val="20"/>
-          <w:szCs w:val="20"/>
-        </w:rPr>
-        <w:t>Adaptable and deadline-focused, able to manage multiple tasks while maintaining quality.</w:t>
-      </w:r>
+          <w:sz w:val="20"/>
+          <w:szCs w:val="20"/>
+        </w:rPr>
+      </w:pPr>
     </w:p>
     <w:sectPr>
       <w:pgSz w:w="11906" w:h="16838"/>

</xml_diff>